<commit_message>
[PAPER] Update supplementary repository links to anonymous 4open.science URL
</commit_message>
<xml_diff>
--- a/paper/ScamShield_JAIT_Manuscript.docx
+++ b/paper/ScamShield_JAIT_Manuscript.docx
@@ -78,7 +78,7 @@
           <w:rFonts w:ascii="Times New Roman" w:hAnsi="Times New Roman"/>
           <w:sz w:val="18"/>
         </w:rPr>
-        <w:t>Telecommunications fraud and smishing in Vietnam exploit localized linguistic evasion, including regional slang, teencode abbreviations, and diacritic omission. Conventional defenses suffer from elevated false-negative rates under symmetric loss or induce severe alarm fatigue when relying on solitary cloud Large Language Models. We present ScamShield-VN, an integrated two-tier architecture pairing an on-device edge screener with a consolidated three-agent forensic council. Tier 1 deploys ViSoBERT fine-tuned with Cost-Sensitive Weighted Binary Cross-Entropy loss ($\alpha=5.0$) and quantized via ONNX INT8 ($98.42\text{ MB}$ / $93.86\text{ MiB}$, $70.7\text{ ms}$ CPU latency). Across five independent training seeds evaluated on stratified validation partitions ($351/367$ pooled scam detections), ViSoBERT achieves $95.64\% \pm 2.04\%$ macro-average scam recall and $92.51\%$ Scam-F1 ($94.51\%$ Macro-F1). When deployed as a quantized engine on the locked frozen holdout benchmark ($N=267$, $192$ benign, $75$ scam, threshold $\theta_{\text{scam}}=0.90$), it attains $96.00\%$ scam recall ($72/75$, exact $95\%$ Clopper-Pearson confidence interval (CI): $[88.8\%, 99.2\%]$) and $4.17\%$ false-positive rate ($8/192$), significantly outperforming solitary Gemini 3.5 Flash in paired correctness ($p &lt; 0.0001$). On an exploratory suite ($N=384$), the cascade resolves $96.6\%$ of traffic locally at $70.7\text{ ms}$ per-message median latency ($267.5\text{ ms}$ mean system latency), attaining $97.40\%$ accuracy, $2.37\%$ false-alarm rate, and $\$0.0153$ marginal cloud cost per 1,000 messages. In paired testing on a 117-sample challenge suite, 3-agent and 5-agent councils showed no statistically significant difference ($p = 0.0625$); the 3-agent panel reduced token cost by $40\%$ while preserving a $0.00\%$ false-alarm rate on authentic transactional and service notifications.</w:t>
+        <w:t>Vietnamese scam and phishing messages often evade detection through teencode, slang, and omitted diacritics, while conventional defenses suffer from high false-negative rates or induce severe alarm fatigue under solitary cloud detectors. We evaluate ScamShield-VN, an empirical two-tier architecture combining an on-device ViSoBERT screener with a three-agent forensic council for uncertain cases. Tier 1 fine-tunes ViSoBERT using Cost-Sensitive Weighted Binary Cross-Entropy loss ($\alpha = 5.0$) and ONNX INT8 quantization ($98.42\text{ MB}$, $70.7\text{ ms}$ median CPU latency). Across five independent training seeds, the five-run mean scam recall was $95.64\% \pm 2.04\%$ and mean Macro-F1 was $94.51\% \pm 0.96\%$. On a locked frozen holdout of 267 messages ($\theta_{\text{scam}} = 0.90$), ViSoBERT attained $96.00\%$ scam recall ($72/75$; exact $95\%$ Clopper-Pearson CI: $[88.75\%, 99.17\%]$) and $4.17\%$ false-positive rate ($8/192$), significantly outperforming solitary Gemini 3.5 Flash in paired correctness ($p &lt; 0.0001$). On a separate 117-message challenge set, a single-LLM baseline achieved higher raw scam recall ($97.96\%$) with two false alarms. The three-agent council incurred zero false alarms on 19 benign lures (exact $95\%$ Clopper-Pearson CI: $[0.00\%, 17.65\%]$) while abstaining on 10 edge cases. Relative to a five-agent panel, the three-agent council reduced API queries by $40.0\%$ but incurred a $5.10$ percentage point drop in scam recall (exact paired $p = 0.0625$). On an exploratory 384-message development set, the cascade resolved $96.6\%$ of traffic locally at $267.5\text{ ms}$ mean system latency and an estimated marginal API cost of $\$0.0153$ per 1,000 messages. These empirical findings support selective cloud referral, while false alarms and abstentions warrant verification on larger independent cohorts.</w:t>
       </w:r>
     </w:p>
     <w:p>
@@ -282,7 +282,7 @@
           <w:rFonts w:ascii="Times New Roman" w:hAnsi="Times New Roman"/>
           <w:sz w:val="18"/>
         </w:rPr>
-        <w:t>The remainder of this paper is structured according to the JAIT publication guidelines: Section II (Literature Review) reviews relevant literature thematically and chronologically across four research themes. Section III (Materials and Methods) outlines materials, loss formulation, ONNX edge quantization, and the multi-agent council. Section IV (Result and Discussion) presents empirical results, statistical tests, and Pareto trade-off discussions. Finally, Section V (Conclusion) concludes the paper with engineering implications and future directions.</w:t>
+        <w:t>The remainder of this paper is structured according to the JAIT publication guidelines: Section II (Literature Review) reviews relevant literature thematically and chronologically across four research themes. Section III (Materials and Methods) outlines materials, loss formulation, ONNX edge quantization, and the multi-agent council. Section IV (Result and Discussion) presents empirical results, statistical tests, and Pareto trade-off discussions. Finally, Section V (Conclusion) concludes the paper with engineering implications and future directions. Full prompts, model cards, and raw confusion matrices are archived in the accompanying Supplementary Material (available anonymously for peer review at [https://anonymous.4open.science/r/ScamShield_Supplementary_Material-B582/](https://anonymous.4open.science/r/ScamShield_Supplementary_Material-B582/)).</w:t>
       </w:r>
     </w:p>
     <w:p>
@@ -6212,6 +6212,62 @@
         <w:t>[35] A. L. Edwards, “Note on the ‘correction for continuity’ in testing the significance of the difference between correlated proportions,” _Psychometrika_, vol. 13, no. 3, pp. 185–187, 1948. doi: [10.1007/BF02289261](https://doi.org/10.1007/BF02289261).</w:t>
       </w:r>
     </w:p>
+    <w:p>
+      <w:pPr>
+        <w:spacing w:before="200" w:after="80"/>
+        <w:jc w:val="center"/>
+      </w:pPr>
+      <w:r>
+        <w:rPr>
+          <w:rFonts w:ascii="Times New Roman" w:hAnsi="Times New Roman"/>
+          <w:b/>
+          <w:sz w:val="20"/>
+        </w:rPr>
+        <w:t>Conflict of Interest</w:t>
+      </w:r>
+    </w:p>
+    <w:p>
+      <w:pPr>
+        <w:spacing w:after="60" w:line="252" w:lineRule="auto"/>
+        <w:ind w:firstLine="216"/>
+        <w:jc w:val="both"/>
+      </w:pPr>
+      <w:r>
+        <w:rPr>
+          <w:rFonts w:ascii="Times New Roman" w:hAnsi="Times New Roman"/>
+          <w:sz w:val="18"/>
+        </w:rPr>
+        <w:t>The authors declare no conflict of interest.</w:t>
+      </w:r>
+    </w:p>
+    <w:p>
+      <w:pPr>
+        <w:spacing w:after="60" w:line="252" w:lineRule="auto"/>
+        <w:ind w:firstLine="216"/>
+        <w:jc w:val="both"/>
+      </w:pPr>
+      <w:r>
+        <w:rPr>
+          <w:rFonts w:ascii="Times New Roman" w:hAnsi="Times New Roman"/>
+          <w:sz w:val="18"/>
+        </w:rPr>
+        <w:t>## Data and Code Availability</w:t>
+      </w:r>
+    </w:p>
+    <w:p>
+      <w:pPr>
+        <w:spacing w:after="60" w:line="252" w:lineRule="auto"/>
+        <w:ind w:firstLine="216"/>
+        <w:jc w:val="both"/>
+      </w:pPr>
+      <w:r>
+        <w:rPr>
+          <w:rFonts w:ascii="Times New Roman" w:hAnsi="Times New Roman"/>
+          <w:sz w:val="18"/>
+        </w:rPr>
+        <w:t>To facilitate replication, artifacts, models, and scripts are deposited at the root repository `https://github.com/QuangWorkIT/RBL_ScamShield`. The locked Frozen Test Partition ($N=267$, $192$ Ham, $75$ Scam) is cryptographically sealed with an SHA-256 checksum in the repository manifest. For double-blind peer review, verbatim system prompts, full confusion matrices, and parameter sweeps are archived in the anonymous supplementary repository at [https://anonymous.4open.science/r/ScamShield_Supplementary_Material-B582/](https://anonymous.4open.science/r/ScamShield_Supplementary_Material-B582/).</w:t>
+      </w:r>
+    </w:p>
     <w:sectPr>
       <w:pgSz w:w="12240" w:h="15840"/>
       <w:pgMar w:top="1080" w:right="1080" w:bottom="1080" w:left="1080" w:header="720" w:footer="720" w:gutter="0"/>

</xml_diff>

<commit_message>
[PAPER] Reorder floats in Section III: Fig 1 (2-Tier Pipeline) -> Table I (Novelty Matrix) -> Table II (Dataset Sources)
</commit_message>
<xml_diff>
--- a/paper/ScamShield_JAIT_Manuscript.docx
+++ b/paper/ScamShield_JAIT_Manuscript.docx
@@ -730,14 +730,15 @@
     </w:p>
     <w:p>
       <w:pPr>
-        <w:spacing w:after="60" w:line="252" w:lineRule="auto"/>
-        <w:ind w:firstLine="216"/>
+        <w:spacing w:before="120" w:after="80"/>
+        <w:ind w:firstLine="0"/>
         <w:jc w:val="both"/>
       </w:pPr>
       <w:r>
         <w:rPr>
           <w:rFonts w:ascii="Times New Roman" w:hAnsi="Times New Roman"/>
-          <w:sz w:val="18"/>
+          <w:i/>
+          <w:sz w:val="16"/>
         </w:rPr>
         <w:t>Note: Reported metrics are extracted from corresponding publications evaluated on heterogeneous datasets, hardware environments, and task formulations; they illustrate comparative architectural paradigms rather than direct benchmark parity.`</w:t>
       </w:r>

</xml_diff>